<commit_message>
fixed some TDD formatting
</commit_message>
<xml_diff>
--- a/TDD-ProjectCrescentRise-DavidStrikaitis-c00283152.docx
+++ b/TDD-ProjectCrescentRise-DavidStrikaitis-c00283152.docx
@@ -1364,7 +1364,7 @@
       </w:r>
       <w:bookmarkEnd w:id="1943051316"/>
     </w:p>
-    <w:p xmlns:wp14="http://schemas.microsoft.com/office/word/2010/wordml" wp14:textId="6178F8BC">
+    <w:p xmlns:wp14="http://schemas.microsoft.com/office/word/2010/wordml" wp14:textId="37F2C405">
       <w:pPr>
         <w:spacing w:before="240" w:beforeAutospacing="off" w:after="240" w:afterAutospacing="off"/>
       </w:pPr>
@@ -1386,7 +1386,7 @@
           <w:szCs w:val="24"/>
           <w:lang w:val="en-IE"/>
         </w:rPr>
-        <w:t>cewrtain</w:t>
+        <w:t>certain</w:t>
       </w:r>
       <w:r>
         <w:rPr>
@@ -1416,7 +1416,326 @@
           <w:szCs w:val="24"/>
           <w:lang w:val="en-IE"/>
         </w:rPr>
-        <w:t xml:space="preserve"> how unity handles objects calling functions in other game objects in a decoupled way this ended up looking like such Game Object 1 needs to call another game objects function (will use player shoot enemy as example) player gets all enemies (through tags) / player checks for transform hit scan on enemy / player hits enemy sends message of hit, with damage amount ~ explained next / enemy health controller receives hit / enemy health changes / dies</w:t>
+        <w:t xml:space="preserve"> how unity handles objects calling functions in other game objects in a decoupled way this ended up looking like such Game Object 1 needs to call another game objects function (will use player shoot enemy as example) </w:t>
+      </w:r>
+    </w:p>
+    <w:p xmlns:wp14="http://schemas.microsoft.com/office/word/2010/wordml" wp14:textId="5E68DAA0">
+      <w:pPr>
+        <w:spacing w:before="240" w:beforeAutospacing="off" w:after="240" w:afterAutospacing="off"/>
+        <w:rPr>
+          <w:rFonts w:ascii="Times New Roman" w:hAnsi="Times New Roman" w:eastAsia="Times New Roman" w:cs="Times New Roman"/>
+          <w:noProof w:val="0"/>
+          <w:sz w:val="24"/>
+          <w:szCs w:val="24"/>
+          <w:lang w:val="en-IE"/>
+        </w:rPr>
+      </w:pPr>
+    </w:p>
+    <w:p xmlns:wp14="http://schemas.microsoft.com/office/word/2010/wordml" wp14:textId="5A010648">
+      <w:pPr>
+        <w:spacing w:before="240" w:beforeAutospacing="off" w:after="240" w:afterAutospacing="off"/>
+        <w:rPr>
+          <w:rFonts w:ascii="Times New Roman" w:hAnsi="Times New Roman" w:eastAsia="Times New Roman" w:cs="Times New Roman"/>
+          <w:noProof w:val="0"/>
+          <w:sz w:val="24"/>
+          <w:szCs w:val="24"/>
+          <w:lang w:val="en-IE"/>
+        </w:rPr>
+      </w:pPr>
+    </w:p>
+    <w:p xmlns:wp14="http://schemas.microsoft.com/office/word/2010/wordml" wp14:textId="27B2F753">
+      <w:pPr>
+        <w:spacing w:before="240" w:beforeAutospacing="off" w:after="240" w:afterAutospacing="off"/>
+        <w:rPr>
+          <w:rFonts w:ascii="Times New Roman" w:hAnsi="Times New Roman" w:eastAsia="Times New Roman" w:cs="Times New Roman"/>
+          <w:noProof w:val="0"/>
+          <w:sz w:val="24"/>
+          <w:szCs w:val="24"/>
+          <w:lang w:val="en-IE"/>
+        </w:rPr>
+      </w:pPr>
+    </w:p>
+    <w:p xmlns:wp14="http://schemas.microsoft.com/office/word/2010/wordml" wp14:textId="71C65288">
+      <w:pPr>
+        <w:spacing w:before="240" w:beforeAutospacing="off" w:after="240" w:afterAutospacing="off"/>
+        <w:jc w:val="center"/>
+      </w:pPr>
+      <w:r>
+        <w:rPr>
+          <w:rFonts w:ascii="Times New Roman" w:hAnsi="Times New Roman" w:eastAsia="Times New Roman" w:cs="Times New Roman"/>
+          <w:noProof w:val="0"/>
+          <w:sz w:val="24"/>
+          <w:szCs w:val="24"/>
+          <w:lang w:val="en-IE"/>
+        </w:rPr>
+        <w:t xml:space="preserve">player gets all enemies (through tags) </w:t>
+      </w:r>
+    </w:p>
+    <w:p xmlns:wp14="http://schemas.microsoft.com/office/word/2010/wordml" wp14:textId="609CFE00">
+      <w:pPr>
+        <w:spacing w:before="240" w:beforeAutospacing="off" w:after="240" w:afterAutospacing="off"/>
+        <w:jc w:val="center"/>
+      </w:pPr>
+      <w:r>
+        <w:rPr>
+          <w:rFonts w:ascii="Times New Roman" w:hAnsi="Times New Roman" w:eastAsia="Times New Roman" w:cs="Times New Roman"/>
+          <w:noProof w:val="0"/>
+          <w:sz w:val="24"/>
+          <w:szCs w:val="24"/>
+          <w:lang w:val="en-IE"/>
+        </w:rPr>
+        <w:t>\/</w:t>
+      </w:r>
+    </w:p>
+    <w:p xmlns:wp14="http://schemas.microsoft.com/office/word/2010/wordml" wp14:textId="348B6937">
+      <w:pPr>
+        <w:spacing w:before="240" w:beforeAutospacing="off" w:after="240" w:afterAutospacing="off"/>
+        <w:jc w:val="center"/>
+      </w:pPr>
+      <w:r>
+        <w:rPr>
+          <w:rFonts w:ascii="Times New Roman" w:hAnsi="Times New Roman" w:eastAsia="Times New Roman" w:cs="Times New Roman"/>
+          <w:noProof w:val="0"/>
+          <w:sz w:val="24"/>
+          <w:szCs w:val="24"/>
+          <w:lang w:val="en-IE"/>
+        </w:rPr>
+        <w:t xml:space="preserve"> player checks for transform hit scan on enemy</w:t>
+      </w:r>
+    </w:p>
+    <w:p xmlns:wp14="http://schemas.microsoft.com/office/word/2010/wordml" wp14:textId="26215751">
+      <w:pPr>
+        <w:spacing w:before="240" w:beforeAutospacing="off" w:after="240" w:afterAutospacing="off"/>
+        <w:jc w:val="center"/>
+      </w:pPr>
+      <w:r>
+        <w:rPr>
+          <w:rFonts w:ascii="Times New Roman" w:hAnsi="Times New Roman" w:eastAsia="Times New Roman" w:cs="Times New Roman"/>
+          <w:noProof w:val="0"/>
+          <w:sz w:val="24"/>
+          <w:szCs w:val="24"/>
+          <w:lang w:val="en-IE"/>
+        </w:rPr>
+        <w:t>\</w:t>
+      </w:r>
+      <w:r>
+        <w:rPr>
+          <w:rFonts w:ascii="Times New Roman" w:hAnsi="Times New Roman" w:eastAsia="Times New Roman" w:cs="Times New Roman"/>
+          <w:noProof w:val="0"/>
+          <w:sz w:val="24"/>
+          <w:szCs w:val="24"/>
+          <w:lang w:val="en-IE"/>
+        </w:rPr>
+        <w:t xml:space="preserve">/ </w:t>
+      </w:r>
+    </w:p>
+    <w:p xmlns:wp14="http://schemas.microsoft.com/office/word/2010/wordml" wp14:textId="7E792C17">
+      <w:pPr>
+        <w:spacing w:before="240" w:beforeAutospacing="off" w:after="240" w:afterAutospacing="off"/>
+        <w:jc w:val="center"/>
+      </w:pPr>
+      <w:r>
+        <w:rPr>
+          <w:rFonts w:ascii="Times New Roman" w:hAnsi="Times New Roman" w:eastAsia="Times New Roman" w:cs="Times New Roman"/>
+          <w:noProof w:val="0"/>
+          <w:sz w:val="24"/>
+          <w:szCs w:val="24"/>
+          <w:lang w:val="en-IE"/>
+        </w:rPr>
+        <w:t>player</w:t>
+      </w:r>
+      <w:r>
+        <w:rPr>
+          <w:rFonts w:ascii="Times New Roman" w:hAnsi="Times New Roman" w:eastAsia="Times New Roman" w:cs="Times New Roman"/>
+          <w:noProof w:val="0"/>
+          <w:sz w:val="24"/>
+          <w:szCs w:val="24"/>
+          <w:lang w:val="en-IE"/>
+        </w:rPr>
+        <w:t xml:space="preserve"> hits enemy sends message of hit, with damage amount ~ explained next</w:t>
+      </w:r>
+    </w:p>
+    <w:p xmlns:wp14="http://schemas.microsoft.com/office/word/2010/wordml" wp14:textId="1B393A8E">
+      <w:pPr>
+        <w:spacing w:before="240" w:beforeAutospacing="off" w:after="240" w:afterAutospacing="off"/>
+        <w:jc w:val="center"/>
+      </w:pPr>
+      <w:r>
+        <w:rPr>
+          <w:rFonts w:ascii="Times New Roman" w:hAnsi="Times New Roman" w:eastAsia="Times New Roman" w:cs="Times New Roman"/>
+          <w:noProof w:val="0"/>
+          <w:sz w:val="24"/>
+          <w:szCs w:val="24"/>
+          <w:lang w:val="en-IE"/>
+        </w:rPr>
+        <w:t xml:space="preserve"> </w:t>
+      </w:r>
+      <w:r>
+        <w:rPr>
+          <w:rFonts w:ascii="Times New Roman" w:hAnsi="Times New Roman" w:eastAsia="Times New Roman" w:cs="Times New Roman"/>
+          <w:noProof w:val="0"/>
+          <w:sz w:val="24"/>
+          <w:szCs w:val="24"/>
+          <w:lang w:val="en-IE"/>
+        </w:rPr>
+        <w:t>\</w:t>
+      </w:r>
+      <w:r>
+        <w:rPr>
+          <w:rFonts w:ascii="Times New Roman" w:hAnsi="Times New Roman" w:eastAsia="Times New Roman" w:cs="Times New Roman"/>
+          <w:noProof w:val="0"/>
+          <w:sz w:val="24"/>
+          <w:szCs w:val="24"/>
+          <w:lang w:val="en-IE"/>
+        </w:rPr>
+        <w:t xml:space="preserve">/ </w:t>
+      </w:r>
+    </w:p>
+    <w:p xmlns:wp14="http://schemas.microsoft.com/office/word/2010/wordml" wp14:textId="3B11BDA4">
+      <w:pPr>
+        <w:spacing w:before="240" w:beforeAutospacing="off" w:after="240" w:afterAutospacing="off"/>
+        <w:jc w:val="center"/>
+      </w:pPr>
+      <w:r>
+        <w:rPr>
+          <w:rFonts w:ascii="Times New Roman" w:hAnsi="Times New Roman" w:eastAsia="Times New Roman" w:cs="Times New Roman"/>
+          <w:noProof w:val="0"/>
+          <w:sz w:val="24"/>
+          <w:szCs w:val="24"/>
+          <w:lang w:val="en-IE"/>
+        </w:rPr>
+        <w:t>enemy</w:t>
+      </w:r>
+      <w:r>
+        <w:rPr>
+          <w:rFonts w:ascii="Times New Roman" w:hAnsi="Times New Roman" w:eastAsia="Times New Roman" w:cs="Times New Roman"/>
+          <w:noProof w:val="0"/>
+          <w:sz w:val="24"/>
+          <w:szCs w:val="24"/>
+          <w:lang w:val="en-IE"/>
+        </w:rPr>
+        <w:t xml:space="preserve"> health controller receives hit</w:t>
+      </w:r>
+    </w:p>
+    <w:p xmlns:wp14="http://schemas.microsoft.com/office/word/2010/wordml" wp14:textId="3DC22825">
+      <w:pPr>
+        <w:spacing w:before="240" w:beforeAutospacing="off" w:after="240" w:afterAutospacing="off"/>
+        <w:jc w:val="center"/>
+      </w:pPr>
+      <w:r>
+        <w:rPr>
+          <w:rFonts w:ascii="Times New Roman" w:hAnsi="Times New Roman" w:eastAsia="Times New Roman" w:cs="Times New Roman"/>
+          <w:noProof w:val="0"/>
+          <w:sz w:val="24"/>
+          <w:szCs w:val="24"/>
+          <w:lang w:val="en-IE"/>
+        </w:rPr>
+        <w:t xml:space="preserve"> </w:t>
+      </w:r>
+      <w:r>
+        <w:rPr>
+          <w:rFonts w:ascii="Times New Roman" w:hAnsi="Times New Roman" w:eastAsia="Times New Roman" w:cs="Times New Roman"/>
+          <w:noProof w:val="0"/>
+          <w:sz w:val="24"/>
+          <w:szCs w:val="24"/>
+          <w:lang w:val="en-IE"/>
+        </w:rPr>
+        <w:t>\</w:t>
+      </w:r>
+      <w:r>
+        <w:rPr>
+          <w:rFonts w:ascii="Times New Roman" w:hAnsi="Times New Roman" w:eastAsia="Times New Roman" w:cs="Times New Roman"/>
+          <w:noProof w:val="0"/>
+          <w:sz w:val="24"/>
+          <w:szCs w:val="24"/>
+          <w:lang w:val="en-IE"/>
+        </w:rPr>
+        <w:t xml:space="preserve">/ </w:t>
+      </w:r>
+    </w:p>
+    <w:p xmlns:wp14="http://schemas.microsoft.com/office/word/2010/wordml" wp14:textId="23AB4EA9">
+      <w:pPr>
+        <w:spacing w:before="240" w:beforeAutospacing="off" w:after="240" w:afterAutospacing="off"/>
+        <w:jc w:val="center"/>
+      </w:pPr>
+      <w:r>
+        <w:rPr>
+          <w:rFonts w:ascii="Times New Roman" w:hAnsi="Times New Roman" w:eastAsia="Times New Roman" w:cs="Times New Roman"/>
+          <w:noProof w:val="0"/>
+          <w:sz w:val="24"/>
+          <w:szCs w:val="24"/>
+          <w:lang w:val="en-IE"/>
+        </w:rPr>
+        <w:t>enemy</w:t>
+      </w:r>
+      <w:r>
+        <w:rPr>
+          <w:rFonts w:ascii="Times New Roman" w:hAnsi="Times New Roman" w:eastAsia="Times New Roman" w:cs="Times New Roman"/>
+          <w:noProof w:val="0"/>
+          <w:sz w:val="24"/>
+          <w:szCs w:val="24"/>
+          <w:lang w:val="en-IE"/>
+        </w:rPr>
+        <w:t xml:space="preserve"> health changes</w:t>
+      </w:r>
+    </w:p>
+    <w:p xmlns:wp14="http://schemas.microsoft.com/office/word/2010/wordml" wp14:textId="47C655B3">
+      <w:pPr>
+        <w:spacing w:before="240" w:beforeAutospacing="off" w:after="240" w:afterAutospacing="off"/>
+        <w:jc w:val="center"/>
+      </w:pPr>
+      <w:r>
+        <w:rPr>
+          <w:rFonts w:ascii="Times New Roman" w:hAnsi="Times New Roman" w:eastAsia="Times New Roman" w:cs="Times New Roman"/>
+          <w:noProof w:val="0"/>
+          <w:sz w:val="24"/>
+          <w:szCs w:val="24"/>
+          <w:lang w:val="en-IE"/>
+        </w:rPr>
+        <w:t xml:space="preserve"> </w:t>
+      </w:r>
+      <w:r>
+        <w:rPr>
+          <w:rFonts w:ascii="Times New Roman" w:hAnsi="Times New Roman" w:eastAsia="Times New Roman" w:cs="Times New Roman"/>
+          <w:noProof w:val="0"/>
+          <w:sz w:val="24"/>
+          <w:szCs w:val="24"/>
+          <w:lang w:val="en-IE"/>
+        </w:rPr>
+        <w:t>\</w:t>
+      </w:r>
+      <w:r>
+        <w:rPr>
+          <w:rFonts w:ascii="Times New Roman" w:hAnsi="Times New Roman" w:eastAsia="Times New Roman" w:cs="Times New Roman"/>
+          <w:noProof w:val="0"/>
+          <w:sz w:val="24"/>
+          <w:szCs w:val="24"/>
+          <w:lang w:val="en-IE"/>
+        </w:rPr>
+        <w:t xml:space="preserve">/ </w:t>
+      </w:r>
+    </w:p>
+    <w:p xmlns:wp14="http://schemas.microsoft.com/office/word/2010/wordml" wp14:textId="379A5676">
+      <w:pPr>
+        <w:spacing w:before="240" w:beforeAutospacing="off" w:after="240" w:afterAutospacing="off"/>
+        <w:jc w:val="center"/>
+        <w:rPr>
+          <w:rFonts w:ascii="Times New Roman" w:hAnsi="Times New Roman" w:eastAsia="Times New Roman" w:cs="Times New Roman"/>
+          <w:noProof w:val="0"/>
+          <w:sz w:val="24"/>
+          <w:szCs w:val="24"/>
+          <w:lang w:val="en-IE"/>
+        </w:rPr>
+      </w:pPr>
+      <w:r>
+        <w:rPr>
+          <w:rFonts w:ascii="Times New Roman" w:hAnsi="Times New Roman" w:eastAsia="Times New Roman" w:cs="Times New Roman"/>
+          <w:noProof w:val="0"/>
+          <w:sz w:val="24"/>
+          <w:szCs w:val="24"/>
+          <w:lang w:val="en-IE"/>
+        </w:rPr>
+        <w:t>dies</w:t>
       </w:r>
     </w:p>
     <w:p xmlns:wp14="http://schemas.microsoft.com/office/word/2010/wordml" wp14:textId="377F245E">

</xml_diff>